<commit_message>
v0004 | chore(governance): standardize commit messages to ordinal v0000 format
- Update .agents/rules/auto-git-push.md to strictly enforce 'v{####} | <type>(<scope>): <summary>' prefix
- Calculate ordinal counter dynamically from git history (v0001 to v9999)
- Refresh log_github_lastrun telemetry records
</commit_message>
<xml_diff>
--- a/src/docs/telemetry/log_github_lastrun.docx
+++ b/src/docs/telemetry/log_github_lastrun.docx
@@ -71,7 +71,7 @@
           </w:tcPr>
           <w:p>
             <w:r>
-              <w:t>9caa20e</w:t>
+              <w:t>dc82f65</w:t>
             </w:r>
           </w:p>
         </w:tc>
@@ -101,7 +101,7 @@
           </w:tcPr>
           <w:p>
             <w:r>
-              <w:t>feat(pipeline): implement multi-stage notebook suite, UNIPLU parquet loader, and governance services</w:t>
+              <w:t>v0004 | chore(governance): standardize commit messages to ordinal v0000 format</w:t>
             </w:r>
           </w:p>
         </w:tc>
@@ -113,7 +113,91 @@
           </w:tcPr>
           <w:p>
             <w:r>
-              <w:t>dfded5c</w:t>
+              <w:t>d1a4e42</w:t>
+            </w:r>
+          </w:p>
+        </w:tc>
+        <w:tc>
+          <w:tcPr>
+            <w:tcW w:type="dxa" w:w="2160"/>
+          </w:tcPr>
+          <w:p>
+            <w:r>
+              <w:t>2026-10-06</w:t>
+            </w:r>
+          </w:p>
+        </w:tc>
+        <w:tc>
+          <w:tcPr>
+            <w:tcW w:type="dxa" w:w="2160"/>
+          </w:tcPr>
+          <w:p>
+            <w:r>
+              <w:t>Lindemberg Vidal</w:t>
+            </w:r>
+          </w:p>
+        </w:tc>
+        <w:tc>
+          <w:tcPr>
+            <w:tcW w:type="dxa" w:w="2160"/>
+          </w:tcPr>
+          <w:p>
+            <w:r>
+              <w:t>v0003 | chore(governance): add auto-commit and push policy rule</w:t>
+            </w:r>
+          </w:p>
+        </w:tc>
+      </w:tr>
+      <w:tr>
+        <w:tc>
+          <w:tcPr>
+            <w:tcW w:type="dxa" w:w="2160"/>
+          </w:tcPr>
+          <w:p>
+            <w:r>
+              <w:t>37c84df</w:t>
+            </w:r>
+          </w:p>
+        </w:tc>
+        <w:tc>
+          <w:tcPr>
+            <w:tcW w:type="dxa" w:w="2160"/>
+          </w:tcPr>
+          <w:p>
+            <w:r>
+              <w:t>2026-10-06</w:t>
+            </w:r>
+          </w:p>
+        </w:tc>
+        <w:tc>
+          <w:tcPr>
+            <w:tcW w:type="dxa" w:w="2160"/>
+          </w:tcPr>
+          <w:p>
+            <w:r>
+              <w:t>Lindemberg Vidal</w:t>
+            </w:r>
+          </w:p>
+        </w:tc>
+        <w:tc>
+          <w:tcPr>
+            <w:tcW w:type="dxa" w:w="2160"/>
+          </w:tcPr>
+          <w:p>
+            <w:r>
+              <w:t>v0002 | feat(pipeline): implement multi-stage notebook suite, UNIPLU parquet loader, and governance services</w:t>
+            </w:r>
+          </w:p>
+        </w:tc>
+      </w:tr>
+      <w:tr>
+        <w:tc>
+          <w:tcPr>
+            <w:tcW w:type="dxa" w:w="2160"/>
+          </w:tcPr>
+          <w:p>
+            <w:r>
+              <w:t>6274ac7</w:t>
             </w:r>
           </w:p>
         </w:tc>
@@ -143,7 +227,7 @@
           </w:tcPr>
           <w:p>
             <w:r>
-              <w:t>Initial QC-VORONOI project scaffold</w:t>
+              <w:t>v0001 | chore(init): initial QC-VORONOI project scaffold</w:t>
             </w:r>
           </w:p>
         </w:tc>

</xml_diff>

<commit_message>
v0006 | refactor(naming): standardize Phase 2 notebooks prefix to Quality Control
- Rename '2.1 - Spatial QC - ...' to '2.1 - Quality Control - Delaunay Triangulation and Neighbor Mapping.ipynb'
- Standardize internal notebook H1 titles to follow consistent 'Phase N - Scope' pattern
- Recompile phase telemetry in src/docs/telemetry/
</commit_message>
<xml_diff>
--- a/src/docs/telemetry/log_github_lastrun.docx
+++ b/src/docs/telemetry/log_github_lastrun.docx
@@ -60,6 +60,48 @@
           <w:p>
             <w:r>
               <w:t>Message</w:t>
+            </w:r>
+          </w:p>
+        </w:tc>
+      </w:tr>
+      <w:tr>
+        <w:tc>
+          <w:tcPr>
+            <w:tcW w:type="dxa" w:w="2160"/>
+          </w:tcPr>
+          <w:p>
+            <w:r>
+              <w:t>40e5a03</w:t>
+            </w:r>
+          </w:p>
+        </w:tc>
+        <w:tc>
+          <w:tcPr>
+            <w:tcW w:type="dxa" w:w="2160"/>
+          </w:tcPr>
+          <w:p>
+            <w:r>
+              <w:t>2026-10-06</w:t>
+            </w:r>
+          </w:p>
+        </w:tc>
+        <w:tc>
+          <w:tcPr>
+            <w:tcW w:type="dxa" w:w="2160"/>
+          </w:tcPr>
+          <w:p>
+            <w:r>
+              <w:t>Lindemberg Vidal</w:t>
+            </w:r>
+          </w:p>
+        </w:tc>
+        <w:tc>
+          <w:tcPr>
+            <w:tcW w:type="dxa" w:w="2160"/>
+          </w:tcPr>
+          <w:p>
+            <w:r>
+              <w:t>v0005 | chore(config): update and categorize .gitignore rules</w:t>
             </w:r>
           </w:p>
         </w:tc>

</xml_diff>